<commit_message>
fix(governance): resolve subagent audit non-conformities, update bibliography, and add sbc article draft
</commit_message>
<xml_diff>
--- a/docs/TCC_II_Monografia_Final_Ciencia_da_Computacao_2026.docx
+++ b/docs/TCC_II_Monografia_Final_Ciencia_da_Computacao_2026.docx
@@ -1213,7 +1213,7 @@
           <w:color w:val="000000"/>
           <w:sz w:val="24"/>
         </w:rPr>
-        <w:t>Modelos como BERT (Devlin et al., 2018), GPT-2, GPT-3 (Brown et al., 2020) e seus sucessores demonstraram que o escalonamento de parâmetros, dados e computação produz emergência de capacidades não previamente observadas. Fenômenos como raciocínio em múltiplas etapas, resolução de analogias complexas e geração de código surgem espontaneamente em modelos de escala suficientemente elevada, sem treinamento específico para essas tarefas.</w:t>
+        <w:t>Modelos como BERT (Devlin et al., 2019), GPT-2, GPT-3 (Brown et al., 2020) e seus sucessores demonstraram que o escalonamento de parâmetros, dados e computação produz emergência de capacidades não previamente observadas. Fenômenos como raciocínio em múltiplas etapas, resolução de analogias complexas e geração de código surgem espontaneamente em modelos de escala suficientemente elevada, sem treinamento específico para essas tarefas.</w:t>
       </w:r>
     </w:p>
     <w:p>
@@ -1386,7 +1386,7 @@
           <w:color w:val="000000"/>
           <w:sz w:val="24"/>
         </w:rPr>
-        <w:t>Liu et al. (2021) demonstraram que a posição dos exemplos e instruções dentro de um prompt influencia a distribuição de atenção do modelo sobre os diferentes segmentos. Elementos posicionados no início ou no final da sequência tendem a receber maior peso atencional, fenômeno conhecido como viés posicional. Esse comportamento tem implicações diretas para o design de sistemas de compressão: a preservação de tokens em posições privilegiadas pode ser mais crítica do que a preservação de tokens em posições intermediárias.</w:t>
+        <w:t>Liu et al. (2023) demonstraram que a posição dos exemplos e instruções dentro de um prompt influencia a distribuição de atenção do modelo sobre os diferentes segmentos. Elementos posicionados no início ou no final da sequência tendem a receber maior peso atencional, fenômeno conhecido como viés posicional. Esse comportamento tem implicações diretas para o design de sistemas de compressão: a preservação de tokens em posições privilegiadas pode ser mais crítica do que a preservação de tokens em posições intermediárias.</w:t>
       </w:r>
     </w:p>
     <w:p>
@@ -10608,7 +10608,7 @@
           <w:rFonts w:ascii="Arial" w:hAnsi="Arial"/>
           <w:sz w:val="19"/>
         </w:rPr>
-        <w:t>WEI, Jason et al. Chain-of-thought prompting elicits reasoning in large language models. In: ADVANCES IN NEURAL INFORMATION PROCESSING SYSTEMS (NeurIPS), 35., 2022, New Orleans. Proceedings [...]. Red Hook: Curran Associates, 2022. v. 35, p. 24824–24837. Disponível em: https://proceedings.neurips.cc/paper_files/paper/2022/hash/9d56096ce5236ab6591c4866b4477d88-Abstract-Conference.html. Acesso em: 16 set. 2026.</w:t>
+        <w:t>WEI, Jason et al. Chain-of-thought prompting elicits reasoning in large language models. In: ADVANCES IN NEURAL INFORMATION PROCESSING SYSTEMS (NeurIPS), 35., 2022, New Orleans. Proceedings [...]. Red Hook: Curran Associates, 2022. v. 35, p. 24824–24837. Disponível em: https://proceedings.neurips.cc/paper_files/paper/2022/hash/9d5609613524ecf4f15af0f7b31abca4-Abstract-Conference.html. Acesso em: 16 set. 2026.</w:t>
       </w:r>
     </w:p>
     <w:p>

</xml_diff>